<commit_message>
Update documentation: add git/GitHub section, troubleshooting, cron & cloudflared
</commit_message>
<xml_diff>
--- a/Automation_Pipeline_Documentation.docx
+++ b/Automation_Pipeline_Documentation.docx
@@ -10124,7 +10124,876 @@
           <w:sz w:val="28"/>
           <w:szCs w:val="28"/>
         </w:rPr>
-        <w:t xml:space="preserve">9. Technology Stack</w:t>
+        <w:t xml:space="preserve">9. Version Control (GitHub)</w:t>
+      </w:r>
+    </w:p>
+    <w:p>
+      <w:pPr>
+        <w:spacing w:after="60" w:before="60"/>
+      </w:pPr>
+      <w:r>
+        <w:rPr>
+          <w:rFonts w:ascii="Arial" w:cs="Arial" w:eastAsia="Arial" w:hAnsi="Arial"/>
+          <w:color w:val="000000"/>
+          <w:sz w:val="20"/>
+          <w:szCs w:val="20"/>
+        </w:rPr>
+        <w:t xml:space="preserve">The project is stored in a private GitHub repository. Always push changes after a fix or improvement so you have a clean backup and can roll back if a macOS update breaks something.</w:t>
+      </w:r>
+    </w:p>
+    <w:p>
+      <w:pPr>
+        <w:pStyle w:val="Heading2"/>
+        <w:spacing w:after="80" w:before="200"/>
+      </w:pPr>
+      <w:r>
+        <w:rPr>
+          <w:rFonts w:ascii="Arial" w:cs="Arial" w:eastAsia="Arial" w:hAnsi="Arial"/>
+          <w:b/>
+          <w:bCs/>
+          <w:color w:val="2E75B6"/>
+          <w:sz w:val="24"/>
+          <w:szCs w:val="24"/>
+        </w:rPr>
+        <w:t xml:space="preserve">9.1 First-Time Setup (already done)</w:t>
+      </w:r>
+    </w:p>
+    <w:p>
+      <w:pPr>
+        <w:spacing w:after="60" w:before="60"/>
+      </w:pPr>
+      <w:r>
+        <w:rPr>
+          <w:rFonts w:ascii="Arial" w:cs="Arial" w:eastAsia="Arial" w:hAnsi="Arial"/>
+          <w:color w:val="000000"/>
+          <w:sz w:val="20"/>
+          <w:szCs w:val="20"/>
+        </w:rPr>
+        <w:t xml:space="preserve">The repo was initialised and pushed with:</w:t>
+      </w:r>
+    </w:p>
+    <w:p>
+      <w:pPr>
+        <w:spacing w:after="40" w:before="40"/>
+        <w:ind w:left="720"/>
+      </w:pPr>
+      <w:r>
+        <w:rPr>
+          <w:rFonts w:ascii="Courier New" w:cs="Courier New" w:eastAsia="Courier New" w:hAnsi="Courier New"/>
+          <w:color w:val="3D3D3D"/>
+          <w:sz w:val="18"/>
+          <w:szCs w:val="18"/>
+        </w:rPr>
+        <w:t xml:space="preserve">cd ~/Desktop/Claude-Projects/inspirational-posters</w:t>
+      </w:r>
+    </w:p>
+    <w:p>
+      <w:pPr>
+        <w:spacing w:after="40" w:before="40"/>
+        <w:ind w:left="720"/>
+      </w:pPr>
+      <w:r>
+        <w:rPr>
+          <w:rFonts w:ascii="Courier New" w:cs="Courier New" w:eastAsia="Courier New" w:hAnsi="Courier New"/>
+          <w:color w:val="3D3D3D"/>
+          <w:sz w:val="18"/>
+          <w:szCs w:val="18"/>
+        </w:rPr>
+        <w:t xml:space="preserve">git init</w:t>
+      </w:r>
+    </w:p>
+    <w:p>
+      <w:pPr>
+        <w:spacing w:after="40" w:before="40"/>
+        <w:ind w:left="720"/>
+      </w:pPr>
+      <w:r>
+        <w:rPr>
+          <w:rFonts w:ascii="Courier New" w:cs="Courier New" w:eastAsia="Courier New" w:hAnsi="Courier New"/>
+          <w:color w:val="3D3D3D"/>
+          <w:sz w:val="18"/>
+          <w:szCs w:val="18"/>
+        </w:rPr>
+        <w:t xml:space="preserve">git add .</w:t>
+      </w:r>
+    </w:p>
+    <w:p>
+      <w:pPr>
+        <w:spacing w:after="40" w:before="40"/>
+        <w:ind w:left="720"/>
+      </w:pPr>
+      <w:r>
+        <w:rPr>
+          <w:rFonts w:ascii="Courier New" w:cs="Courier New" w:eastAsia="Courier New" w:hAnsi="Courier New"/>
+          <w:color w:val="3D3D3D"/>
+          <w:sz w:val="18"/>
+          <w:szCs w:val="18"/>
+        </w:rPr>
+        <w:t xml:space="preserve">git commit -m "Initial commit"</w:t>
+      </w:r>
+    </w:p>
+    <w:p>
+      <w:pPr>
+        <w:spacing w:after="40" w:before="40"/>
+        <w:ind w:left="720"/>
+      </w:pPr>
+      <w:r>
+        <w:rPr>
+          <w:rFonts w:ascii="Courier New" w:cs="Courier New" w:eastAsia="Courier New" w:hAnsi="Courier New"/>
+          <w:color w:val="3D3D3D"/>
+          <w:sz w:val="18"/>
+          <w:szCs w:val="18"/>
+        </w:rPr>
+        <w:t xml:space="preserve">git remote add origin https://github.com/YOUR_USERNAME/YOUR_REPO.git</w:t>
+      </w:r>
+    </w:p>
+    <w:p>
+      <w:pPr>
+        <w:spacing w:after="40" w:before="40"/>
+        <w:ind w:left="720"/>
+      </w:pPr>
+      <w:r>
+        <w:rPr>
+          <w:rFonts w:ascii="Courier New" w:cs="Courier New" w:eastAsia="Courier New" w:hAnsi="Courier New"/>
+          <w:color w:val="3D3D3D"/>
+          <w:sz w:val="18"/>
+          <w:szCs w:val="18"/>
+        </w:rPr>
+        <w:t xml:space="preserve">git branch -M main</w:t>
+      </w:r>
+    </w:p>
+    <w:p>
+      <w:pPr>
+        <w:spacing w:after="40" w:before="40"/>
+        <w:ind w:left="720"/>
+      </w:pPr>
+      <w:r>
+        <w:rPr>
+          <w:rFonts w:ascii="Courier New" w:cs="Courier New" w:eastAsia="Courier New" w:hAnsi="Courier New"/>
+          <w:color w:val="3D3D3D"/>
+          <w:sz w:val="18"/>
+          <w:szCs w:val="18"/>
+        </w:rPr>
+        <w:t xml:space="preserve">git push -u origin main</w:t>
+      </w:r>
+    </w:p>
+    <w:p>
+      <w:pPr>
+        <w:pStyle w:val="Heading2"/>
+        <w:spacing w:after="80" w:before="200"/>
+      </w:pPr>
+      <w:r>
+        <w:rPr>
+          <w:rFonts w:ascii="Arial" w:cs="Arial" w:eastAsia="Arial" w:hAnsi="Arial"/>
+          <w:b/>
+          <w:bCs/>
+          <w:color w:val="2E75B6"/>
+          <w:sz w:val="24"/>
+          <w:szCs w:val="24"/>
+        </w:rPr>
+        <w:t xml:space="preserve">9.2 Pushing Changes (use after every fix)</w:t>
+      </w:r>
+    </w:p>
+    <w:p>
+      <w:pPr>
+        <w:spacing w:after="60" w:before="60"/>
+      </w:pPr>
+      <w:r>
+        <w:rPr>
+          <w:rFonts w:ascii="Arial" w:cs="Arial" w:eastAsia="Arial" w:hAnsi="Arial"/>
+          <w:color w:val="000000"/>
+          <w:sz w:val="20"/>
+          <w:szCs w:val="20"/>
+        </w:rPr>
+        <w:t xml:space="preserve">Whenever a script is updated or a bug is fixed, run these three commands in Terminal:</w:t>
+      </w:r>
+    </w:p>
+    <w:p>
+      <w:pPr>
+        <w:spacing w:after="40" w:before="40"/>
+        <w:ind w:left="720"/>
+      </w:pPr>
+      <w:r>
+        <w:rPr>
+          <w:rFonts w:ascii="Courier New" w:cs="Courier New" w:eastAsia="Courier New" w:hAnsi="Courier New"/>
+          <w:color w:val="3D3D3D"/>
+          <w:sz w:val="18"/>
+          <w:szCs w:val="18"/>
+        </w:rPr>
+        <w:t xml:space="preserve">cd ~/Desktop/Claude-Projects/inspirational-posters</w:t>
+      </w:r>
+    </w:p>
+    <w:p>
+      <w:pPr>
+        <w:spacing w:after="40" w:before="40"/>
+        <w:ind w:left="720"/>
+      </w:pPr>
+      <w:r>
+        <w:rPr>
+          <w:rFonts w:ascii="Courier New" w:cs="Courier New" w:eastAsia="Courier New" w:hAnsi="Courier New"/>
+          <w:color w:val="3D3D3D"/>
+          <w:sz w:val="18"/>
+          <w:szCs w:val="18"/>
+        </w:rPr>
+        <w:t xml:space="preserve">git add .</w:t>
+      </w:r>
+    </w:p>
+    <w:p>
+      <w:pPr>
+        <w:spacing w:after="40" w:before="40"/>
+        <w:ind w:left="720"/>
+      </w:pPr>
+      <w:r>
+        <w:rPr>
+          <w:rFonts w:ascii="Courier New" w:cs="Courier New" w:eastAsia="Courier New" w:hAnsi="Courier New"/>
+          <w:color w:val="3D3D3D"/>
+          <w:sz w:val="18"/>
+          <w:szCs w:val="18"/>
+        </w:rPr>
+        <w:t xml:space="preserve">git commit -m "Brief description of what changed"</w:t>
+      </w:r>
+    </w:p>
+    <w:p>
+      <w:pPr>
+        <w:spacing w:after="40" w:before="40"/>
+        <w:ind w:left="720"/>
+      </w:pPr>
+      <w:r>
+        <w:rPr>
+          <w:rFonts w:ascii="Courier New" w:cs="Courier New" w:eastAsia="Courier New" w:hAnsi="Courier New"/>
+          <w:color w:val="3D3D3D"/>
+          <w:sz w:val="18"/>
+          <w:szCs w:val="18"/>
+        </w:rPr>
+        <w:t xml:space="preserve">git push</w:t>
+      </w:r>
+    </w:p>
+    <w:p>
+      <w:pPr>
+        <w:spacing w:after="0" w:before="40"/>
+      </w:pPr>
+    </w:p>
+    <w:p>
+      <w:pPr>
+        <w:spacing w:after="60" w:before="60"/>
+      </w:pPr>
+      <w:r>
+        <w:rPr>
+          <w:rFonts w:ascii="Arial" w:cs="Arial" w:eastAsia="Arial" w:hAnsi="Arial"/>
+          <w:color w:val="000000"/>
+          <w:sz w:val="20"/>
+          <w:szCs w:val="20"/>
+        </w:rPr>
+        <w:t xml:space="preserve">Examples of good commit messages:</w:t>
+      </w:r>
+    </w:p>
+    <w:p>
+      <w:pPr>
+        <w:pStyle w:val="ListParagraph"/>
+        <w:numPr>
+          <w:ilvl w:val="0"/>
+          <w:numId w:val="2"/>
+        </w:numPr>
+        <w:spacing w:after="40" w:before="40"/>
+      </w:pPr>
+      <w:r>
+        <w:rPr>
+          <w:rFonts w:ascii="Arial" w:cs="Arial" w:eastAsia="Arial" w:hAnsi="Arial"/>
+          <w:color w:val="000000"/>
+          <w:sz w:val="20"/>
+          <w:szCs w:val="20"/>
+        </w:rPr>
+        <w:t xml:space="preserve">Fix WhatsApp page load timeout (increased to 90s)</w:t>
+      </w:r>
+    </w:p>
+    <w:p>
+      <w:pPr>
+        <w:pStyle w:val="ListParagraph"/>
+        <w:numPr>
+          <w:ilvl w:val="0"/>
+          <w:numId w:val="2"/>
+        </w:numPr>
+        <w:spacing w:after="40" w:before="40"/>
+      </w:pPr>
+      <w:r>
+        <w:rPr>
+          <w:rFonts w:ascii="Arial" w:cs="Arial" w:eastAsia="Arial" w:hAnsi="Arial"/>
+          <w:color w:val="000000"/>
+          <w:sz w:val="20"/>
+          <w:szCs w:val="20"/>
+        </w:rPr>
+        <w:t xml:space="preserve">Switch scheduler from LaunchAgent to cron (macOS 26 compatibility)</w:t>
+      </w:r>
+    </w:p>
+    <w:p>
+      <w:pPr>
+        <w:pStyle w:val="ListParagraph"/>
+        <w:numPr>
+          <w:ilvl w:val="0"/>
+          <w:numId w:val="2"/>
+        </w:numPr>
+        <w:spacing w:after="40" w:before="40"/>
+      </w:pPr>
+      <w:r>
+        <w:rPr>
+          <w:rFonts w:ascii="Arial" w:cs="Arial" w:eastAsia="Arial" w:hAnsi="Arial"/>
+          <w:color w:val="000000"/>
+          <w:sz w:val="20"/>
+          <w:szCs w:val="20"/>
+        </w:rPr>
+        <w:t xml:space="preserve">Add cloudflared tunnel for mobile approval</w:t>
+      </w:r>
+    </w:p>
+    <w:p>
+      <w:pPr>
+        <w:pStyle w:val="ListParagraph"/>
+        <w:numPr>
+          <w:ilvl w:val="0"/>
+          <w:numId w:val="2"/>
+        </w:numPr>
+        <w:spacing w:after="40" w:before="40"/>
+      </w:pPr>
+      <w:r>
+        <w:rPr>
+          <w:rFonts w:ascii="Arial" w:cs="Arial" w:eastAsia="Arial" w:hAnsi="Arial"/>
+          <w:color w:val="000000"/>
+          <w:sz w:val="20"/>
+          <w:szCs w:val="20"/>
+        </w:rPr>
+        <w:t xml:space="preserve">Update quote database with new Tamil verses</w:t>
+      </w:r>
+    </w:p>
+    <w:p>
+      <w:pPr>
+        <w:pStyle w:val="Heading2"/>
+        <w:spacing w:after="80" w:before="200"/>
+      </w:pPr>
+      <w:r>
+        <w:rPr>
+          <w:rFonts w:ascii="Arial" w:cs="Arial" w:eastAsia="Arial" w:hAnsi="Arial"/>
+          <w:b/>
+          <w:bCs/>
+          <w:color w:val="2E75B6"/>
+          <w:sz w:val="24"/>
+          <w:szCs w:val="24"/>
+        </w:rPr>
+        <w:t xml:space="preserve">9.3 What is and isn't stored in GitHub</w:t>
+      </w:r>
+    </w:p>
+    <w:p>
+      <w:pPr>
+        <w:spacing w:after="60" w:before="60"/>
+      </w:pPr>
+      <w:r>
+        <w:rPr>
+          <w:rFonts w:ascii="Arial" w:cs="Arial" w:eastAsia="Arial" w:hAnsi="Arial"/>
+          <w:color w:val="000000"/>
+          <w:sz w:val="20"/>
+          <w:szCs w:val="20"/>
+        </w:rPr>
+        <w:t xml:space="preserve">The .gitignore file ensures sensitive credentials and generated output are never uploaded:</w:t>
+      </w:r>
+    </w:p>
+    <w:tbl>
+      <w:tblPr>
+        <w:tblW w:type="dxa" w:w="9360"/>
+        <w:tblBorders>
+          <w:top w:val="single" w:color="auto" w:sz="4"/>
+          <w:left w:val="single" w:color="auto" w:sz="4"/>
+          <w:bottom w:val="single" w:color="auto" w:sz="4"/>
+          <w:right w:val="single" w:color="auto" w:sz="4"/>
+          <w:insideH w:val="single" w:color="auto" w:sz="4"/>
+          <w:insideV w:val="single" w:color="auto" w:sz="4"/>
+        </w:tblBorders>
+      </w:tblPr>
+      <w:tblGrid>
+        <w:gridCol w:w="4680"/>
+        <w:gridCol w:w="4680"/>
+      </w:tblGrid>
+      <w:tr>
+        <w:tc>
+          <w:tcPr>
+            <w:tcW w:type="dxa" w:w="4680"/>
+            <w:tcBorders>
+              <w:top w:val="single" w:color="CCCCCC" w:sz="1"/>
+              <w:left w:val="single" w:color="CCCCCC" w:sz="1"/>
+              <w:bottom w:val="single" w:color="CCCCCC" w:sz="1"/>
+              <w:right w:val="single" w:color="CCCCCC" w:sz="1"/>
+            </w:tcBorders>
+            <w:shd w:fill="D5E8F0" w:val="clear"/>
+            <w:tcMar>
+              <w:top w:type="dxa" w:w="80"/>
+              <w:left w:type="dxa" w:w="120"/>
+              <w:bottom w:type="dxa" w:w="80"/>
+              <w:right w:type="dxa" w:w="120"/>
+            </w:tcMar>
+            <w:vAlign w:val="center"/>
+          </w:tcPr>
+          <w:p>
+            <w:r>
+              <w:rPr>
+                <w:rFonts w:ascii="Arial" w:cs="Arial" w:eastAsia="Arial" w:hAnsi="Arial"/>
+                <w:b/>
+                <w:bCs/>
+                <w:color w:val="1F4E79"/>
+                <w:sz w:val="18"/>
+                <w:szCs w:val="18"/>
+              </w:rPr>
+              <w:t xml:space="preserve">Included in GitHub</w:t>
+            </w:r>
+          </w:p>
+        </w:tc>
+        <w:tc>
+          <w:tcPr>
+            <w:tcW w:type="dxa" w:w="4680"/>
+            <w:tcBorders>
+              <w:top w:val="single" w:color="CCCCCC" w:sz="1"/>
+              <w:left w:val="single" w:color="CCCCCC" w:sz="1"/>
+              <w:bottom w:val="single" w:color="CCCCCC" w:sz="1"/>
+              <w:right w:val="single" w:color="CCCCCC" w:sz="1"/>
+            </w:tcBorders>
+            <w:shd w:fill="D5E8F0" w:val="clear"/>
+            <w:tcMar>
+              <w:top w:type="dxa" w:w="80"/>
+              <w:left w:type="dxa" w:w="120"/>
+              <w:bottom w:type="dxa" w:w="80"/>
+              <w:right w:type="dxa" w:w="120"/>
+            </w:tcMar>
+            <w:vAlign w:val="center"/>
+          </w:tcPr>
+          <w:p>
+            <w:r>
+              <w:rPr>
+                <w:rFonts w:ascii="Arial" w:cs="Arial" w:eastAsia="Arial" w:hAnsi="Arial"/>
+                <w:b/>
+                <w:bCs/>
+                <w:color w:val="1F4E79"/>
+                <w:sz w:val="18"/>
+                <w:szCs w:val="18"/>
+              </w:rPr>
+              <w:t xml:space="preserve">Excluded from GitHub</w:t>
+            </w:r>
+          </w:p>
+        </w:tc>
+      </w:tr>
+      <w:tr>
+        <w:tc>
+          <w:tcPr>
+            <w:tcW w:type="dxa" w:w="4680"/>
+            <w:tcBorders>
+              <w:top w:val="single" w:color="CCCCCC" w:sz="1"/>
+              <w:left w:val="single" w:color="CCCCCC" w:sz="1"/>
+              <w:bottom w:val="single" w:color="CCCCCC" w:sz="1"/>
+              <w:right w:val="single" w:color="CCCCCC" w:sz="1"/>
+            </w:tcBorders>
+            <w:shd w:fill="FFFFFF" w:val="clear"/>
+            <w:tcMar>
+              <w:top w:type="dxa" w:w="80"/>
+              <w:left w:type="dxa" w:w="120"/>
+              <w:bottom w:type="dxa" w:w="80"/>
+              <w:right w:type="dxa" w:w="120"/>
+            </w:tcMar>
+            <w:vAlign w:val="center"/>
+          </w:tcPr>
+          <w:p>
+            <w:r>
+              <w:rPr>
+                <w:rFonts w:ascii="Arial" w:cs="Arial" w:eastAsia="Arial" w:hAnsi="Arial"/>
+                <w:color w:val="000000"/>
+                <w:sz w:val="18"/>
+                <w:szCs w:val="18"/>
+              </w:rPr>
+              <w:t xml:space="preserve">All Python scripts (*.py)</w:t>
+            </w:r>
+          </w:p>
+        </w:tc>
+        <w:tc>
+          <w:tcPr>
+            <w:tcW w:type="dxa" w:w="4680"/>
+            <w:tcBorders>
+              <w:top w:val="single" w:color="CCCCCC" w:sz="1"/>
+              <w:left w:val="single" w:color="CCCCCC" w:sz="1"/>
+              <w:bottom w:val="single" w:color="CCCCCC" w:sz="1"/>
+              <w:right w:val="single" w:color="CCCCCC" w:sz="1"/>
+            </w:tcBorders>
+            <w:shd w:fill="FFFFFF" w:val="clear"/>
+            <w:tcMar>
+              <w:top w:type="dxa" w:w="80"/>
+              <w:left w:type="dxa" w:w="120"/>
+              <w:bottom w:type="dxa" w:w="80"/>
+              <w:right w:type="dxa" w:w="120"/>
+            </w:tcMar>
+            <w:vAlign w:val="center"/>
+          </w:tcPr>
+          <w:p>
+            <w:r>
+              <w:rPr>
+                <w:rFonts w:ascii="Arial" w:cs="Arial" w:eastAsia="Arial" w:hAnsi="Arial"/>
+                <w:color w:val="000000"/>
+                <w:sz w:val="18"/>
+                <w:szCs w:val="18"/>
+              </w:rPr>
+              <w:t xml:space="preserve">email_config.json (Gmail App Password)</w:t>
+            </w:r>
+          </w:p>
+        </w:tc>
+      </w:tr>
+      <w:tr>
+        <w:tc>
+          <w:tcPr>
+            <w:tcW w:type="dxa" w:w="4680"/>
+            <w:tcBorders>
+              <w:top w:val="single" w:color="CCCCCC" w:sz="1"/>
+              <w:left w:val="single" w:color="CCCCCC" w:sz="1"/>
+              <w:bottom w:val="single" w:color="CCCCCC" w:sz="1"/>
+              <w:right w:val="single" w:color="CCCCCC" w:sz="1"/>
+            </w:tcBorders>
+            <w:shd w:fill="EBF3FA" w:val="clear"/>
+            <w:tcMar>
+              <w:top w:type="dxa" w:w="80"/>
+              <w:left w:type="dxa" w:w="120"/>
+              <w:bottom w:type="dxa" w:w="80"/>
+              <w:right w:type="dxa" w:w="120"/>
+            </w:tcMar>
+            <w:vAlign w:val="center"/>
+          </w:tcPr>
+          <w:p>
+            <w:r>
+              <w:rPr>
+                <w:rFonts w:ascii="Arial" w:cs="Arial" w:eastAsia="Arial" w:hAnsi="Arial"/>
+                <w:color w:val="000000"/>
+                <w:sz w:val="18"/>
+                <w:szCs w:val="18"/>
+              </w:rPr>
+              <w:t xml:space="preserve">Shell wrappers (run_daily.sh, etc.)</w:t>
+            </w:r>
+          </w:p>
+        </w:tc>
+        <w:tc>
+          <w:tcPr>
+            <w:tcW w:type="dxa" w:w="4680"/>
+            <w:tcBorders>
+              <w:top w:val="single" w:color="CCCCCC" w:sz="1"/>
+              <w:left w:val="single" w:color="CCCCCC" w:sz="1"/>
+              <w:bottom w:val="single" w:color="CCCCCC" w:sz="1"/>
+              <w:right w:val="single" w:color="CCCCCC" w:sz="1"/>
+            </w:tcBorders>
+            <w:shd w:fill="EBF3FA" w:val="clear"/>
+            <w:tcMar>
+              <w:top w:type="dxa" w:w="80"/>
+              <w:left w:type="dxa" w:w="120"/>
+              <w:bottom w:type="dxa" w:w="80"/>
+              <w:right w:type="dxa" w:w="120"/>
+            </w:tcMar>
+            <w:vAlign w:val="center"/>
+          </w:tcPr>
+          <w:p>
+            <w:r>
+              <w:rPr>
+                <w:rFonts w:ascii="Arial" w:cs="Arial" w:eastAsia="Arial" w:hAnsi="Arial"/>
+                <w:color w:val="000000"/>
+                <w:sz w:val="18"/>
+                <w:szCs w:val="18"/>
+              </w:rPr>
+              <w:t xml:space="preserve">instagram_credentials.json (Instagram password)</w:t>
+            </w:r>
+          </w:p>
+        </w:tc>
+      </w:tr>
+      <w:tr>
+        <w:tc>
+          <w:tcPr>
+            <w:tcW w:type="dxa" w:w="4680"/>
+            <w:tcBorders>
+              <w:top w:val="single" w:color="CCCCCC" w:sz="1"/>
+              <w:left w:val="single" w:color="CCCCCC" w:sz="1"/>
+              <w:bottom w:val="single" w:color="CCCCCC" w:sz="1"/>
+              <w:right w:val="single" w:color="CCCCCC" w:sz="1"/>
+            </w:tcBorders>
+            <w:shd w:fill="FFFFFF" w:val="clear"/>
+            <w:tcMar>
+              <w:top w:type="dxa" w:w="80"/>
+              <w:left w:type="dxa" w:w="120"/>
+              <w:bottom w:type="dxa" w:w="80"/>
+              <w:right w:type="dxa" w:w="120"/>
+            </w:tcMar>
+            <w:vAlign w:val="center"/>
+          </w:tcPr>
+          <w:p>
+            <w:r>
+              <w:rPr>
+                <w:rFonts w:ascii="Arial" w:cs="Arial" w:eastAsia="Arial" w:hAnsi="Arial"/>
+                <w:color w:val="000000"/>
+                <w:sz w:val="18"/>
+                <w:szCs w:val="18"/>
+              </w:rPr>
+              <w:t xml:space="preserve">Quote JSON files (quotes/)</w:t>
+            </w:r>
+          </w:p>
+        </w:tc>
+        <w:tc>
+          <w:tcPr>
+            <w:tcW w:type="dxa" w:w="4680"/>
+            <w:tcBorders>
+              <w:top w:val="single" w:color="CCCCCC" w:sz="1"/>
+              <w:left w:val="single" w:color="CCCCCC" w:sz="1"/>
+              <w:bottom w:val="single" w:color="CCCCCC" w:sz="1"/>
+              <w:right w:val="single" w:color="CCCCCC" w:sz="1"/>
+            </w:tcBorders>
+            <w:shd w:fill="FFFFFF" w:val="clear"/>
+            <w:tcMar>
+              <w:top w:type="dxa" w:w="80"/>
+              <w:left w:type="dxa" w:w="120"/>
+              <w:bottom w:type="dxa" w:w="80"/>
+              <w:right w:type="dxa" w:w="120"/>
+            </w:tcMar>
+            <w:vAlign w:val="center"/>
+          </w:tcPr>
+          <w:p>
+            <w:r>
+              <w:rPr>
+                <w:rFonts w:ascii="Arial" w:cs="Arial" w:eastAsia="Arial" w:hAnsi="Arial"/>
+                <w:color w:val="000000"/>
+                <w:sz w:val="18"/>
+                <w:szCs w:val="18"/>
+              </w:rPr>
+              <w:t xml:space="preserve">output/ folder (posters, logs, caches)</w:t>
+            </w:r>
+          </w:p>
+        </w:tc>
+      </w:tr>
+      <w:tr>
+        <w:tc>
+          <w:tcPr>
+            <w:tcW w:type="dxa" w:w="4680"/>
+            <w:tcBorders>
+              <w:top w:val="single" w:color="CCCCCC" w:sz="1"/>
+              <w:left w:val="single" w:color="CCCCCC" w:sz="1"/>
+              <w:bottom w:val="single" w:color="CCCCCC" w:sz="1"/>
+              <w:right w:val="single" w:color="CCCCCC" w:sz="1"/>
+            </w:tcBorders>
+            <w:shd w:fill="EBF3FA" w:val="clear"/>
+            <w:tcMar>
+              <w:top w:type="dxa" w:w="80"/>
+              <w:left w:type="dxa" w:w="120"/>
+              <w:bottom w:type="dxa" w:w="80"/>
+              <w:right w:type="dxa" w:w="120"/>
+            </w:tcMar>
+            <w:vAlign w:val="center"/>
+          </w:tcPr>
+          <w:p>
+            <w:r>
+              <w:rPr>
+                <w:rFonts w:ascii="Arial" w:cs="Arial" w:eastAsia="Arial" w:hAnsi="Arial"/>
+                <w:color w:val="000000"/>
+                <w:sz w:val="18"/>
+                <w:szCs w:val="18"/>
+              </w:rPr>
+              <w:t xml:space="preserve">Config (config.py)</w:t>
+            </w:r>
+          </w:p>
+        </w:tc>
+        <w:tc>
+          <w:tcPr>
+            <w:tcW w:type="dxa" w:w="4680"/>
+            <w:tcBorders>
+              <w:top w:val="single" w:color="CCCCCC" w:sz="1"/>
+              <w:left w:val="single" w:color="CCCCCC" w:sz="1"/>
+              <w:bottom w:val="single" w:color="CCCCCC" w:sz="1"/>
+              <w:right w:val="single" w:color="CCCCCC" w:sz="1"/>
+            </w:tcBorders>
+            <w:shd w:fill="EBF3FA" w:val="clear"/>
+            <w:tcMar>
+              <w:top w:type="dxa" w:w="80"/>
+              <w:left w:type="dxa" w:w="120"/>
+              <w:bottom w:type="dxa" w:w="80"/>
+              <w:right w:type="dxa" w:w="120"/>
+            </w:tcMar>
+            <w:vAlign w:val="center"/>
+          </w:tcPr>
+          <w:p>
+            <w:r>
+              <w:rPr>
+                <w:rFonts w:ascii="Arial" w:cs="Arial" w:eastAsia="Arial" w:hAnsi="Arial"/>
+                <w:color w:val="000000"/>
+                <w:sz w:val="18"/>
+                <w:szCs w:val="18"/>
+              </w:rPr>
+              <w:t xml:space="preserve">output/browser_sessions/ (WhatsApp QR session)</w:t>
+            </w:r>
+          </w:p>
+        </w:tc>
+      </w:tr>
+      <w:tr>
+        <w:tc>
+          <w:tcPr>
+            <w:tcW w:type="dxa" w:w="4680"/>
+            <w:tcBorders>
+              <w:top w:val="single" w:color="CCCCCC" w:sz="1"/>
+              <w:left w:val="single" w:color="CCCCCC" w:sz="1"/>
+              <w:bottom w:val="single" w:color="CCCCCC" w:sz="1"/>
+              <w:right w:val="single" w:color="CCCCCC" w:sz="1"/>
+            </w:tcBorders>
+            <w:shd w:fill="FFFFFF" w:val="clear"/>
+            <w:tcMar>
+              <w:top w:type="dxa" w:w="80"/>
+              <w:left w:type="dxa" w:w="120"/>
+              <w:bottom w:type="dxa" w:w="80"/>
+              <w:right w:type="dxa" w:w="120"/>
+            </w:tcMar>
+            <w:vAlign w:val="center"/>
+          </w:tcPr>
+          <w:p>
+            <w:r>
+              <w:rPr>
+                <w:rFonts w:ascii="Arial" w:cs="Arial" w:eastAsia="Arial" w:hAnsi="Arial"/>
+                <w:color w:val="000000"/>
+                <w:sz w:val="18"/>
+                <w:szCs w:val="18"/>
+              </w:rPr>
+              <w:t xml:space="preserve">Automation_Pipeline_Documentation.docx</w:t>
+            </w:r>
+          </w:p>
+        </w:tc>
+        <w:tc>
+          <w:tcPr>
+            <w:tcW w:type="dxa" w:w="4680"/>
+            <w:tcBorders>
+              <w:top w:val="single" w:color="CCCCCC" w:sz="1"/>
+              <w:left w:val="single" w:color="CCCCCC" w:sz="1"/>
+              <w:bottom w:val="single" w:color="CCCCCC" w:sz="1"/>
+              <w:right w:val="single" w:color="CCCCCC" w:sz="1"/>
+            </w:tcBorders>
+            <w:shd w:fill="FFFFFF" w:val="clear"/>
+            <w:tcMar>
+              <w:top w:type="dxa" w:w="80"/>
+              <w:left w:type="dxa" w:w="120"/>
+              <w:bottom w:type="dxa" w:w="80"/>
+              <w:right w:type="dxa" w:w="120"/>
+            </w:tcMar>
+            <w:vAlign w:val="center"/>
+          </w:tcPr>
+          <w:p>
+            <w:r>
+              <w:rPr>
+                <w:rFonts w:ascii="Arial" w:cs="Arial" w:eastAsia="Arial" w:hAnsi="Arial"/>
+                <w:color w:val="000000"/>
+                <w:sz w:val="18"/>
+                <w:szCs w:val="18"/>
+              </w:rPr>
+              <w:t xml:space="preserve">output/instagram_session.json</w:t>
+            </w:r>
+          </w:p>
+        </w:tc>
+      </w:tr>
+      <w:tr>
+        <w:tc>
+          <w:tcPr>
+            <w:tcW w:type="dxa" w:w="4680"/>
+            <w:tcBorders>
+              <w:top w:val="single" w:color="CCCCCC" w:sz="1"/>
+              <w:left w:val="single" w:color="CCCCCC" w:sz="1"/>
+              <w:bottom w:val="single" w:color="CCCCCC" w:sz="1"/>
+              <w:right w:val="single" w:color="CCCCCC" w:sz="1"/>
+            </w:tcBorders>
+            <w:shd w:fill="EBF3FA" w:val="clear"/>
+            <w:tcMar>
+              <w:top w:type="dxa" w:w="80"/>
+              <w:left w:type="dxa" w:w="120"/>
+              <w:bottom w:type="dxa" w:w="80"/>
+              <w:right w:type="dxa" w:w="120"/>
+            </w:tcMar>
+            <w:vAlign w:val="center"/>
+          </w:tcPr>
+          <w:p>
+            <w:r>
+              <w:rPr>
+                <w:rFonts w:ascii="Arial" w:cs="Arial" w:eastAsia="Arial" w:hAnsi="Arial"/>
+                <w:color w:val="000000"/>
+                <w:sz w:val="18"/>
+                <w:szCs w:val="18"/>
+              </w:rPr>
+              <w:t xml:space="preserve">.gitignore itself</w:t>
+            </w:r>
+          </w:p>
+        </w:tc>
+        <w:tc>
+          <w:tcPr>
+            <w:tcW w:type="dxa" w:w="4680"/>
+            <w:tcBorders>
+              <w:top w:val="single" w:color="CCCCCC" w:sz="1"/>
+              <w:left w:val="single" w:color="CCCCCC" w:sz="1"/>
+              <w:bottom w:val="single" w:color="CCCCCC" w:sz="1"/>
+              <w:right w:val="single" w:color="CCCCCC" w:sz="1"/>
+            </w:tcBorders>
+            <w:shd w:fill="EBF3FA" w:val="clear"/>
+            <w:tcMar>
+              <w:top w:type="dxa" w:w="80"/>
+              <w:left w:type="dxa" w:w="120"/>
+              <w:bottom w:type="dxa" w:w="80"/>
+              <w:right w:type="dxa" w:w="120"/>
+            </w:tcMar>
+            <w:vAlign w:val="center"/>
+          </w:tcPr>
+          <w:p>
+            <w:r>
+              <w:rPr>
+                <w:rFonts w:ascii="Arial" w:cs="Arial" w:eastAsia="Arial" w:hAnsi="Arial"/>
+                <w:color w:val="000000"/>
+                <w:sz w:val="18"/>
+                <w:szCs w:val="18"/>
+              </w:rPr>
+              <w:t xml:space="preserve">__pycache__/ and .DS_Store files</w:t>
+            </w:r>
+          </w:p>
+        </w:tc>
+      </w:tr>
+    </w:tbl>
+    <w:p>
+      <w:pPr>
+        <w:spacing w:after="0" w:before="40"/>
+      </w:pPr>
+    </w:p>
+    <w:p>
+      <w:pPr>
+        <w:spacing w:after="80" w:before="80"/>
+        <w:ind w:left="360"/>
+      </w:pPr>
+      <w:r>
+        <w:rPr>
+          <w:rFonts w:ascii="Arial" w:cs="Arial" w:eastAsia="Arial" w:hAnsi="Arial"/>
+          <w:i/>
+          <w:iCs/>
+          <w:color w:val="595959"/>
+          <w:sz w:val="18"/>
+          <w:szCs w:val="18"/>
+        </w:rPr>
+        <w:t xml:space="preserve">To restore the system on a new Mac: clone the repo, re-run setup_automation.py (to re-enter credentials), and scan the WhatsApp QR code once. Everything else is in the repo.</w:t>
+      </w:r>
+    </w:p>
+    <w:p>
+      <w:pPr>
+        <w:spacing w:after="0" w:before="120"/>
+      </w:pPr>
+    </w:p>
+    <w:p>
+      <w:pPr>
+        <w:pStyle w:val="Heading1"/>
+        <w:pBdr>
+          <w:bottom w:val="single" w:color="2E75B6" w:sz="6" w:space="4"/>
+        </w:pBdr>
+        <w:spacing w:after="120" w:before="280"/>
+      </w:pPr>
+      <w:r>
+        <w:rPr>
+          <w:rFonts w:ascii="Arial" w:cs="Arial" w:eastAsia="Arial" w:hAnsi="Arial"/>
+          <w:b/>
+          <w:bCs/>
+          <w:color w:val="1F4E79"/>
+          <w:sz w:val="28"/>
+          <w:szCs w:val="28"/>
+        </w:rPr>
+        <w:t xml:space="preserve">10. Technology Stack</w:t>
       </w:r>
     </w:p>
     <w:tbl>

</xml_diff>